<commit_message>
PRD v2: Lady D sign-off (carte blanche) + accept all open-decision defaults
Co-Authored-By: Claude Opus 4.8 <noreply@anthropic.com>
</commit_message>
<xml_diff>
--- a/Documents/Pursuit-Game-PRD-v2.docx
+++ b/Documents/Pursuit-Game-PRD-v2.docx
@@ -3437,7 +3437,7 @@
                 <w:sz w:val="18"/>
                 <w:szCs w:val="18"/>
               </w:rPr>
-              <w:t xml:space="preserve">[ ]</w:t>
+              <w:t xml:space="preserve">Yes (Lady D)</w:t>
             </w:r>
           </w:p>
         </w:tc>
@@ -3568,7 +3568,7 @@
                 <w:sz w:val="18"/>
                 <w:szCs w:val="18"/>
               </w:rPr>
-              <w:t xml:space="preserve">[ ]</w:t>
+              <w:t xml:space="preserve">Yes (Lady D)</w:t>
             </w:r>
           </w:p>
         </w:tc>
@@ -3696,7 +3696,7 @@
                 <w:sz w:val="18"/>
                 <w:szCs w:val="18"/>
               </w:rPr>
-              <w:t xml:space="preserve">[ ]</w:t>
+              <w:t xml:space="preserve">Yes (Lady D)</w:t>
             </w:r>
           </w:p>
         </w:tc>
@@ -3827,7 +3827,7 @@
                 <w:sz w:val="18"/>
                 <w:szCs w:val="18"/>
               </w:rPr>
-              <w:t xml:space="preserve">[ ]</w:t>
+              <w:t xml:space="preserve">Yes (Lady D)</w:t>
             </w:r>
           </w:p>
         </w:tc>
@@ -3955,7 +3955,7 @@
                 <w:sz w:val="18"/>
                 <w:szCs w:val="18"/>
               </w:rPr>
-              <w:t xml:space="preserve">[ ]</w:t>
+              <w:t xml:space="preserve">Yes (Lady D)</w:t>
             </w:r>
           </w:p>
         </w:tc>
@@ -4086,7 +4086,7 @@
                 <w:sz w:val="18"/>
                 <w:szCs w:val="18"/>
               </w:rPr>
-              <w:t xml:space="preserve">[ ]</w:t>
+              <w:t xml:space="preserve">Yes (Lady D)</w:t>
             </w:r>
           </w:p>
         </w:tc>
@@ -4214,7 +4214,7 @@
                 <w:sz w:val="18"/>
                 <w:szCs w:val="18"/>
               </w:rPr>
-              <w:t xml:space="preserve">[ ]</w:t>
+              <w:t xml:space="preserve">Yes (Lady D)</w:t>
             </w:r>
           </w:p>
         </w:tc>
@@ -4445,7 +4445,7 @@
                 <w:sz w:val="18"/>
                 <w:szCs w:val="18"/>
               </w:rPr>
-              <w:t xml:space="preserve">[ ]</w:t>
+              <w:t xml:space="preserve">Agree</w:t>
             </w:r>
           </w:p>
         </w:tc>
@@ -4547,7 +4547,7 @@
                 <w:sz w:val="18"/>
                 <w:szCs w:val="18"/>
               </w:rPr>
-              <w:t xml:space="preserve">[ ]</w:t>
+              <w:t xml:space="preserve">Agree</w:t>
             </w:r>
           </w:p>
         </w:tc>
@@ -4649,7 +4649,7 @@
                 <w:sz w:val="18"/>
                 <w:szCs w:val="18"/>
               </w:rPr>
-              <w:t xml:space="preserve">[ ]</w:t>
+              <w:t xml:space="preserve">Agree</w:t>
             </w:r>
           </w:p>
         </w:tc>
@@ -4751,7 +4751,7 @@
                 <w:sz w:val="18"/>
                 <w:szCs w:val="18"/>
               </w:rPr>
-              <w:t xml:space="preserve">[ ]</w:t>
+              <w:t xml:space="preserve">Agree</w:t>
             </w:r>
           </w:p>
         </w:tc>
@@ -4853,7 +4853,7 @@
                 <w:sz w:val="18"/>
                 <w:szCs w:val="18"/>
               </w:rPr>
-              <w:t xml:space="preserve">[ ]</w:t>
+              <w:t xml:space="preserve">Agree</w:t>
             </w:r>
           </w:p>
         </w:tc>
@@ -4955,7 +4955,7 @@
                 <w:sz w:val="18"/>
                 <w:szCs w:val="18"/>
               </w:rPr>
-              <w:t xml:space="preserve">[ ]</w:t>
+              <w:t xml:space="preserve">Agree</w:t>
             </w:r>
           </w:p>
         </w:tc>
@@ -5057,7 +5057,7 @@
                 <w:sz w:val="18"/>
                 <w:szCs w:val="18"/>
               </w:rPr>
-              <w:t xml:space="preserve">[ ]</w:t>
+              <w:t xml:space="preserve">Agree</w:t>
             </w:r>
           </w:p>
         </w:tc>
@@ -5159,7 +5159,7 @@
                 <w:sz w:val="18"/>
                 <w:szCs w:val="18"/>
               </w:rPr>
-              <w:t xml:space="preserve">[ ]</w:t>
+              <w:t xml:space="preserve">Agree</w:t>
             </w:r>
           </w:p>
         </w:tc>
@@ -5261,7 +5261,7 @@
                 <w:sz w:val="18"/>
                 <w:szCs w:val="18"/>
               </w:rPr>
-              <w:t xml:space="preserve">[ ]</w:t>
+              <w:t xml:space="preserve">Agree</w:t>
             </w:r>
           </w:p>
         </w:tc>
@@ -5363,7 +5363,7 @@
                 <w:sz w:val="18"/>
                 <w:szCs w:val="18"/>
               </w:rPr>
-              <w:t xml:space="preserve">[ ]</w:t>
+              <w:t xml:space="preserve">Agree</w:t>
             </w:r>
           </w:p>
         </w:tc>
@@ -5421,14 +5421,29 @@
     </w:tbl>
     <w:p>
       <w:pPr>
-        <w:spacing w:before="120"/>
+        <w:spacing w:after="60" w:before="100"/>
       </w:pPr>
       <w:r>
         <w:rPr>
           <w:b/>
           <w:bCs/>
         </w:rPr>
-        <w:t xml:space="preserve">Final agreement:  Lady D ______ (date ____)      Dennis ______ (date ____)</w:t>
+        <w:t xml:space="preserve">Lady D has agreed to PRD v2 in full (carte blanche) on Oct 21, 2026 to let the build begin</w:t>
+      </w:r>
+      <w:r>
+        <w:t xml:space="preserve"> — with the understanding that any point can be adjusted later if Dennis flags a change. Dennis: please skim the camera (Q7) and Platform LLM-vs-scripted (Q2) decisions before starting the 3D, since they affect your work.</w:t>
+      </w:r>
+    </w:p>
+    <w:p>
+      <w:pPr>
+        <w:spacing w:before="40"/>
+      </w:pPr>
+      <w:r>
+        <w:rPr>
+          <w:b/>
+          <w:bCs/>
+        </w:rPr>
+        <w:t xml:space="preserve">Final agreement:  Lady D ✓ (Oct 21, 2026)      Dennis ______ (date ____)</w:t>
       </w:r>
     </w:p>
     <w:p>

</xml_diff>